<commit_message>
Docs: install from PyPI (bulk-rnaseq-pipeline)
1.1.2 is on PyPI (Trusted Publishing, with attestations) and was verified
with `pipx install bulk-rnaseq-pipeline` in a clean HOME (--version 1.1.2,
--check 0 failed), so it is now listed as the install method: README,
INSTALLATION (option A; option C names the Bioconda package and the open
review, bioconda/bioconda-recipes#70436), RELEASE status, and the User Guide
(setup steps 2-3, flowchart, cheat sheet, version 1.1.2, citation).

Co-Authored-By: Claude Opus 5.5 <noreply@anthropic.com>
</commit_message>
<xml_diff>
--- a/docs/RNAseq_Pipeline_User_Guide.docx
+++ b/docs/RNAseq_Pipeline_User_Guide.docx
@@ -54,7 +54,7 @@
           <w:noProof/>
         </w:rPr>
         <w:drawing>
-          <wp:inline distT="0" distB="0" distL="0" distR="0" wp14:anchorId="3F1928C3" wp14:editId="433D8DB7">
+          <wp:inline distT="0" distB="0" distL="0" distR="0" wp14:anchorId="0DBAA088" wp14:editId="4BAD32A2">
             <wp:extent cx="5760720" cy="1679217"/>
             <wp:effectExtent l="0" t="0" r="0" b="0"/>
             <wp:docPr id="1" name="Picture 1"/>
@@ -160,7 +160,7 @@
                 <w:rFonts w:cs="Calibri"/>
                 <w:sz w:val="21"/>
               </w:rPr>
-              <w:t>1.1.1</w:t>
+              <w:t>1.1.2 (PyPI: bulk-rnaseq-pipeline)</w:t>
             </w:r>
           </w:p>
         </w:tc>
@@ -393,7 +393,7 @@
       <w:r>
         <w:fldChar w:fldCharType="separate"/>
       </w:r>
-      <w:hyperlink w:anchor="_Toc243314598" w:history="1">
+      <w:hyperlink w:anchor="_Toc243320021" w:history="1">
         <w:r>
           <w:rPr>
             <w:rStyle w:val="Hyperlink"/>
@@ -420,7 +420,7 @@
             <w:noProof/>
             <w:webHidden/>
           </w:rPr>
-          <w:instrText xml:space="preserve"> PAGEREF _Toc243314598 \h </w:instrText>
+          <w:instrText xml:space="preserve"> PAGEREF _Toc243320021 \h </w:instrText>
         </w:r>
         <w:r>
           <w:rPr>
@@ -468,7 +468,7 @@
           <w14:ligatures w14:val="standardContextual"/>
         </w:rPr>
       </w:pPr>
-      <w:hyperlink w:anchor="_Toc243314599" w:history="1">
+      <w:hyperlink w:anchor="_Toc243320022" w:history="1">
         <w:r>
           <w:rPr>
             <w:rStyle w:val="Hyperlink"/>
@@ -495,7 +495,7 @@
             <w:noProof/>
             <w:webHidden/>
           </w:rPr>
-          <w:instrText xml:space="preserve"> PAGEREF _Toc243314599 \h </w:instrText>
+          <w:instrText xml:space="preserve"> PAGEREF _Toc243320022 \h </w:instrText>
         </w:r>
         <w:r>
           <w:rPr>
@@ -543,7 +543,7 @@
           <w14:ligatures w14:val="standardContextual"/>
         </w:rPr>
       </w:pPr>
-      <w:hyperlink w:anchor="_Toc243314600" w:history="1">
+      <w:hyperlink w:anchor="_Toc243320023" w:history="1">
         <w:r>
           <w:rPr>
             <w:rStyle w:val="Hyperlink"/>
@@ -570,7 +570,7 @@
             <w:noProof/>
             <w:webHidden/>
           </w:rPr>
-          <w:instrText xml:space="preserve"> PAGEREF _Toc243314600 \h </w:instrText>
+          <w:instrText xml:space="preserve"> PAGEREF _Toc243320023 \h </w:instrText>
         </w:r>
         <w:r>
           <w:rPr>
@@ -618,7 +618,7 @@
           <w14:ligatures w14:val="standardContextual"/>
         </w:rPr>
       </w:pPr>
-      <w:hyperlink w:anchor="_Toc243314601" w:history="1">
+      <w:hyperlink w:anchor="_Toc243320024" w:history="1">
         <w:r>
           <w:rPr>
             <w:rStyle w:val="Hyperlink"/>
@@ -645,7 +645,7 @@
             <w:noProof/>
             <w:webHidden/>
           </w:rPr>
-          <w:instrText xml:space="preserve"> PAGEREF _Toc243314601 \h </w:instrText>
+          <w:instrText xml:space="preserve"> PAGEREF _Toc243320024 \h </w:instrText>
         </w:r>
         <w:r>
           <w:rPr>
@@ -693,7 +693,7 @@
           <w14:ligatures w14:val="standardContextual"/>
         </w:rPr>
       </w:pPr>
-      <w:hyperlink w:anchor="_Toc243314602" w:history="1">
+      <w:hyperlink w:anchor="_Toc243320025" w:history="1">
         <w:r>
           <w:rPr>
             <w:rStyle w:val="Hyperlink"/>
@@ -720,7 +720,7 @@
             <w:noProof/>
             <w:webHidden/>
           </w:rPr>
-          <w:instrText xml:space="preserve"> PAGEREF _Toc243314602 \h </w:instrText>
+          <w:instrText xml:space="preserve"> PAGEREF _Toc243320025 \h </w:instrText>
         </w:r>
         <w:r>
           <w:rPr>
@@ -768,7 +768,7 @@
           <w14:ligatures w14:val="standardContextual"/>
         </w:rPr>
       </w:pPr>
-      <w:hyperlink w:anchor="_Toc243314603" w:history="1">
+      <w:hyperlink w:anchor="_Toc243320026" w:history="1">
         <w:r>
           <w:rPr>
             <w:rStyle w:val="Hyperlink"/>
@@ -795,7 +795,7 @@
             <w:noProof/>
             <w:webHidden/>
           </w:rPr>
-          <w:instrText xml:space="preserve"> PAGEREF _Toc243314603 \h </w:instrText>
+          <w:instrText xml:space="preserve"> PAGEREF _Toc243320026 \h </w:instrText>
         </w:r>
         <w:r>
           <w:rPr>
@@ -843,7 +843,7 @@
           <w14:ligatures w14:val="standardContextual"/>
         </w:rPr>
       </w:pPr>
-      <w:hyperlink w:anchor="_Toc243314604" w:history="1">
+      <w:hyperlink w:anchor="_Toc243320027" w:history="1">
         <w:r>
           <w:rPr>
             <w:rStyle w:val="Hyperlink"/>
@@ -870,7 +870,7 @@
             <w:noProof/>
             <w:webHidden/>
           </w:rPr>
-          <w:instrText xml:space="preserve"> PAGEREF _Toc243314604 \h </w:instrText>
+          <w:instrText xml:space="preserve"> PAGEREF _Toc243320027 \h </w:instrText>
         </w:r>
         <w:r>
           <w:rPr>
@@ -918,7 +918,7 @@
           <w14:ligatures w14:val="standardContextual"/>
         </w:rPr>
       </w:pPr>
-      <w:hyperlink w:anchor="_Toc243314605" w:history="1">
+      <w:hyperlink w:anchor="_Toc243320028" w:history="1">
         <w:r>
           <w:rPr>
             <w:rStyle w:val="Hyperlink"/>
@@ -945,7 +945,7 @@
             <w:noProof/>
             <w:webHidden/>
           </w:rPr>
-          <w:instrText xml:space="preserve"> PAGEREF _Toc243314605 \h </w:instrText>
+          <w:instrText xml:space="preserve"> PAGEREF _Toc243320028 \h </w:instrText>
         </w:r>
         <w:r>
           <w:rPr>
@@ -993,7 +993,7 @@
           <w14:ligatures w14:val="standardContextual"/>
         </w:rPr>
       </w:pPr>
-      <w:hyperlink w:anchor="_Toc243314606" w:history="1">
+      <w:hyperlink w:anchor="_Toc243320029" w:history="1">
         <w:r>
           <w:rPr>
             <w:rStyle w:val="Hyperlink"/>
@@ -1020,7 +1020,7 @@
             <w:noProof/>
             <w:webHidden/>
           </w:rPr>
-          <w:instrText xml:space="preserve"> PAGEREF _Toc243314606 \h </w:instrText>
+          <w:instrText xml:space="preserve"> PAGEREF _Toc243320029 \h </w:instrText>
         </w:r>
         <w:r>
           <w:rPr>
@@ -1068,7 +1068,7 @@
           <w14:ligatures w14:val="standardContextual"/>
         </w:rPr>
       </w:pPr>
-      <w:hyperlink w:anchor="_Toc243314607" w:history="1">
+      <w:hyperlink w:anchor="_Toc243320030" w:history="1">
         <w:r>
           <w:rPr>
             <w:rStyle w:val="Hyperlink"/>
@@ -1095,7 +1095,7 @@
             <w:noProof/>
             <w:webHidden/>
           </w:rPr>
-          <w:instrText xml:space="preserve"> PAGEREF _Toc243314607 \h </w:instrText>
+          <w:instrText xml:space="preserve"> PAGEREF _Toc243320030 \h </w:instrText>
         </w:r>
         <w:r>
           <w:rPr>
@@ -1143,7 +1143,7 @@
           <w14:ligatures w14:val="standardContextual"/>
         </w:rPr>
       </w:pPr>
-      <w:hyperlink w:anchor="_Toc243314608" w:history="1">
+      <w:hyperlink w:anchor="_Toc243320031" w:history="1">
         <w:r>
           <w:rPr>
             <w:rStyle w:val="Hyperlink"/>
@@ -1170,7 +1170,7 @@
             <w:noProof/>
             <w:webHidden/>
           </w:rPr>
-          <w:instrText xml:space="preserve"> PAGEREF _Toc243314608 \h </w:instrText>
+          <w:instrText xml:space="preserve"> PAGEREF _Toc243320031 \h </w:instrText>
         </w:r>
         <w:r>
           <w:rPr>
@@ -1218,7 +1218,7 @@
           <w14:ligatures w14:val="standardContextual"/>
         </w:rPr>
       </w:pPr>
-      <w:hyperlink w:anchor="_Toc243314609" w:history="1">
+      <w:hyperlink w:anchor="_Toc243320032" w:history="1">
         <w:r>
           <w:rPr>
             <w:rStyle w:val="Hyperlink"/>
@@ -1245,7 +1245,7 @@
             <w:noProof/>
             <w:webHidden/>
           </w:rPr>
-          <w:instrText xml:space="preserve"> PAGEREF _Toc243314609 \h </w:instrText>
+          <w:instrText xml:space="preserve"> PAGEREF _Toc243320032 \h </w:instrText>
         </w:r>
         <w:r>
           <w:rPr>
@@ -1293,7 +1293,7 @@
           <w14:ligatures w14:val="standardContextual"/>
         </w:rPr>
       </w:pPr>
-      <w:hyperlink w:anchor="_Toc243314610" w:history="1">
+      <w:hyperlink w:anchor="_Toc243320033" w:history="1">
         <w:r>
           <w:rPr>
             <w:rStyle w:val="Hyperlink"/>
@@ -1320,7 +1320,7 @@
             <w:noProof/>
             <w:webHidden/>
           </w:rPr>
-          <w:instrText xml:space="preserve"> PAGEREF _Toc243314610 \h </w:instrText>
+          <w:instrText xml:space="preserve"> PAGEREF _Toc243320033 \h </w:instrText>
         </w:r>
         <w:r>
           <w:rPr>
@@ -1368,7 +1368,7 @@
           <w14:ligatures w14:val="standardContextual"/>
         </w:rPr>
       </w:pPr>
-      <w:hyperlink w:anchor="_Toc243314611" w:history="1">
+      <w:hyperlink w:anchor="_Toc243320034" w:history="1">
         <w:r>
           <w:rPr>
             <w:rStyle w:val="Hyperlink"/>
@@ -1395,7 +1395,7 @@
             <w:noProof/>
             <w:webHidden/>
           </w:rPr>
-          <w:instrText xml:space="preserve"> PAGEREF _Toc243314611 \h </w:instrText>
+          <w:instrText xml:space="preserve"> PAGEREF _Toc243320034 \h </w:instrText>
         </w:r>
         <w:r>
           <w:rPr>
@@ -1443,7 +1443,7 @@
           <w14:ligatures w14:val="standardContextual"/>
         </w:rPr>
       </w:pPr>
-      <w:hyperlink w:anchor="_Toc243314612" w:history="1">
+      <w:hyperlink w:anchor="_Toc243320035" w:history="1">
         <w:r>
           <w:rPr>
             <w:rStyle w:val="Hyperlink"/>
@@ -1470,7 +1470,7 @@
             <w:noProof/>
             <w:webHidden/>
           </w:rPr>
-          <w:instrText xml:space="preserve"> PAGEREF _Toc243314612 \h </w:instrText>
+          <w:instrText xml:space="preserve"> PAGEREF _Toc243320035 \h </w:instrText>
         </w:r>
         <w:r>
           <w:rPr>
@@ -1518,7 +1518,7 @@
           <w14:ligatures w14:val="standardContextual"/>
         </w:rPr>
       </w:pPr>
-      <w:hyperlink w:anchor="_Toc243314613" w:history="1">
+      <w:hyperlink w:anchor="_Toc243320036" w:history="1">
         <w:r>
           <w:rPr>
             <w:rStyle w:val="Hyperlink"/>
@@ -1545,7 +1545,7 @@
             <w:noProof/>
             <w:webHidden/>
           </w:rPr>
-          <w:instrText xml:space="preserve"> PAGEREF _Toc243314613 \h </w:instrText>
+          <w:instrText xml:space="preserve"> PAGEREF _Toc243320036 \h </w:instrText>
         </w:r>
         <w:r>
           <w:rPr>
@@ -1593,7 +1593,7 @@
           <w14:ligatures w14:val="standardContextual"/>
         </w:rPr>
       </w:pPr>
-      <w:hyperlink w:anchor="_Toc243314614" w:history="1">
+      <w:hyperlink w:anchor="_Toc243320037" w:history="1">
         <w:r>
           <w:rPr>
             <w:rStyle w:val="Hyperlink"/>
@@ -1620,7 +1620,7 @@
             <w:noProof/>
             <w:webHidden/>
           </w:rPr>
-          <w:instrText xml:space="preserve"> PAGEREF _Toc243314614 \h </w:instrText>
+          <w:instrText xml:space="preserve"> PAGEREF _Toc243320037 \h </w:instrText>
         </w:r>
         <w:r>
           <w:rPr>
@@ -1668,7 +1668,7 @@
           <w14:ligatures w14:val="standardContextual"/>
         </w:rPr>
       </w:pPr>
-      <w:hyperlink w:anchor="_Toc243314615" w:history="1">
+      <w:hyperlink w:anchor="_Toc243320038" w:history="1">
         <w:r>
           <w:rPr>
             <w:rStyle w:val="Hyperlink"/>
@@ -1695,7 +1695,7 @@
             <w:noProof/>
             <w:webHidden/>
           </w:rPr>
-          <w:instrText xml:space="preserve"> PAGEREF _Toc243314615 \h </w:instrText>
+          <w:instrText xml:space="preserve"> PAGEREF _Toc243320038 \h </w:instrText>
         </w:r>
         <w:r>
           <w:rPr>
@@ -1743,7 +1743,7 @@
           <w14:ligatures w14:val="standardContextual"/>
         </w:rPr>
       </w:pPr>
-      <w:hyperlink w:anchor="_Toc243314616" w:history="1">
+      <w:hyperlink w:anchor="_Toc243320039" w:history="1">
         <w:r>
           <w:rPr>
             <w:rStyle w:val="Hyperlink"/>
@@ -1770,7 +1770,7 @@
             <w:noProof/>
             <w:webHidden/>
           </w:rPr>
-          <w:instrText xml:space="preserve"> PAGEREF _Toc243314616 \h </w:instrText>
+          <w:instrText xml:space="preserve"> PAGEREF _Toc243320039 \h </w:instrText>
         </w:r>
         <w:r>
           <w:rPr>
@@ -1818,7 +1818,7 @@
           <w14:ligatures w14:val="standardContextual"/>
         </w:rPr>
       </w:pPr>
-      <w:hyperlink w:anchor="_Toc243314617" w:history="1">
+      <w:hyperlink w:anchor="_Toc243320040" w:history="1">
         <w:r>
           <w:rPr>
             <w:rStyle w:val="Hyperlink"/>
@@ -1845,7 +1845,7 @@
             <w:noProof/>
             <w:webHidden/>
           </w:rPr>
-          <w:instrText xml:space="preserve"> PAGEREF _Toc243314617 \h </w:instrText>
+          <w:instrText xml:space="preserve"> PAGEREF _Toc243320040 \h </w:instrText>
         </w:r>
         <w:r>
           <w:rPr>
@@ -1893,7 +1893,7 @@
           <w14:ligatures w14:val="standardContextual"/>
         </w:rPr>
       </w:pPr>
-      <w:hyperlink w:anchor="_Toc243314618" w:history="1">
+      <w:hyperlink w:anchor="_Toc243320041" w:history="1">
         <w:r>
           <w:rPr>
             <w:rStyle w:val="Hyperlink"/>
@@ -1920,7 +1920,7 @@
             <w:noProof/>
             <w:webHidden/>
           </w:rPr>
-          <w:instrText xml:space="preserve"> PAGEREF _Toc243314618 \h </w:instrText>
+          <w:instrText xml:space="preserve"> PAGEREF _Toc243320041 \h </w:instrText>
         </w:r>
         <w:r>
           <w:rPr>
@@ -1968,7 +1968,7 @@
           <w14:ligatures w14:val="standardContextual"/>
         </w:rPr>
       </w:pPr>
-      <w:hyperlink w:anchor="_Toc243314619" w:history="1">
+      <w:hyperlink w:anchor="_Toc243320042" w:history="1">
         <w:r>
           <w:rPr>
             <w:rStyle w:val="Hyperlink"/>
@@ -1995,7 +1995,7 @@
             <w:noProof/>
             <w:webHidden/>
           </w:rPr>
-          <w:instrText xml:space="preserve"> PAGEREF _Toc243314619 \h </w:instrText>
+          <w:instrText xml:space="preserve"> PAGEREF _Toc243320042 \h </w:instrText>
         </w:r>
         <w:r>
           <w:rPr>
@@ -2043,7 +2043,7 @@
           <w14:ligatures w14:val="standardContextual"/>
         </w:rPr>
       </w:pPr>
-      <w:hyperlink w:anchor="_Toc243314620" w:history="1">
+      <w:hyperlink w:anchor="_Toc243320043" w:history="1">
         <w:r>
           <w:rPr>
             <w:rStyle w:val="Hyperlink"/>
@@ -2070,7 +2070,7 @@
             <w:noProof/>
             <w:webHidden/>
           </w:rPr>
-          <w:instrText xml:space="preserve"> PAGEREF _Toc243314620 \h </w:instrText>
+          <w:instrText xml:space="preserve"> PAGEREF _Toc243320043 \h </w:instrText>
         </w:r>
         <w:r>
           <w:rPr>
@@ -2118,7 +2118,7 @@
           <w14:ligatures w14:val="standardContextual"/>
         </w:rPr>
       </w:pPr>
-      <w:hyperlink w:anchor="_Toc243314621" w:history="1">
+      <w:hyperlink w:anchor="_Toc243320044" w:history="1">
         <w:r>
           <w:rPr>
             <w:rStyle w:val="Hyperlink"/>
@@ -2145,7 +2145,7 @@
             <w:noProof/>
             <w:webHidden/>
           </w:rPr>
-          <w:instrText xml:space="preserve"> PAGEREF _Toc243314621 \h </w:instrText>
+          <w:instrText xml:space="preserve"> PAGEREF _Toc243320044 \h </w:instrText>
         </w:r>
         <w:r>
           <w:rPr>
@@ -2193,7 +2193,7 @@
           <w14:ligatures w14:val="standardContextual"/>
         </w:rPr>
       </w:pPr>
-      <w:hyperlink w:anchor="_Toc243314622" w:history="1">
+      <w:hyperlink w:anchor="_Toc243320045" w:history="1">
         <w:r>
           <w:rPr>
             <w:rStyle w:val="Hyperlink"/>
@@ -2220,7 +2220,7 @@
             <w:noProof/>
             <w:webHidden/>
           </w:rPr>
-          <w:instrText xml:space="preserve"> PAGEREF _Toc243314622 \h </w:instrText>
+          <w:instrText xml:space="preserve"> PAGEREF _Toc243320045 \h </w:instrText>
         </w:r>
         <w:r>
           <w:rPr>
@@ -2268,7 +2268,7 @@
           <w14:ligatures w14:val="standardContextual"/>
         </w:rPr>
       </w:pPr>
-      <w:hyperlink w:anchor="_Toc243314623" w:history="1">
+      <w:hyperlink w:anchor="_Toc243320046" w:history="1">
         <w:r>
           <w:rPr>
             <w:rStyle w:val="Hyperlink"/>
@@ -2295,7 +2295,7 @@
             <w:noProof/>
             <w:webHidden/>
           </w:rPr>
-          <w:instrText xml:space="preserve"> PAGEREF _Toc243314623 \h </w:instrText>
+          <w:instrText xml:space="preserve"> PAGEREF _Toc243320046 \h </w:instrText>
         </w:r>
         <w:r>
           <w:rPr>
@@ -2343,7 +2343,7 @@
           <w14:ligatures w14:val="standardContextual"/>
         </w:rPr>
       </w:pPr>
-      <w:hyperlink w:anchor="_Toc243314624" w:history="1">
+      <w:hyperlink w:anchor="_Toc243320047" w:history="1">
         <w:r>
           <w:rPr>
             <w:rStyle w:val="Hyperlink"/>
@@ -2370,7 +2370,7 @@
             <w:noProof/>
             <w:webHidden/>
           </w:rPr>
-          <w:instrText xml:space="preserve"> PAGEREF _Toc243314624 \h </w:instrText>
+          <w:instrText xml:space="preserve"> PAGEREF _Toc243320047 \h </w:instrText>
         </w:r>
         <w:r>
           <w:rPr>
@@ -2418,7 +2418,7 @@
           <w14:ligatures w14:val="standardContextual"/>
         </w:rPr>
       </w:pPr>
-      <w:hyperlink w:anchor="_Toc243314625" w:history="1">
+      <w:hyperlink w:anchor="_Toc243320048" w:history="1">
         <w:r>
           <w:rPr>
             <w:rStyle w:val="Hyperlink"/>
@@ -2445,7 +2445,7 @@
             <w:noProof/>
             <w:webHidden/>
           </w:rPr>
-          <w:instrText xml:space="preserve"> PAGEREF _Toc243314625 \h </w:instrText>
+          <w:instrText xml:space="preserve"> PAGEREF _Toc243320048 \h </w:instrText>
         </w:r>
         <w:r>
           <w:rPr>
@@ -2493,7 +2493,7 @@
           <w14:ligatures w14:val="standardContextual"/>
         </w:rPr>
       </w:pPr>
-      <w:hyperlink w:anchor="_Toc243314626" w:history="1">
+      <w:hyperlink w:anchor="_Toc243320049" w:history="1">
         <w:r>
           <w:rPr>
             <w:rStyle w:val="Hyperlink"/>
@@ -2520,7 +2520,7 @@
             <w:noProof/>
             <w:webHidden/>
           </w:rPr>
-          <w:instrText xml:space="preserve"> PAGEREF _Toc243314626 \h </w:instrText>
+          <w:instrText xml:space="preserve"> PAGEREF _Toc243320049 \h </w:instrText>
         </w:r>
         <w:r>
           <w:rPr>
@@ -2568,7 +2568,7 @@
           <w14:ligatures w14:val="standardContextual"/>
         </w:rPr>
       </w:pPr>
-      <w:hyperlink w:anchor="_Toc243314627" w:history="1">
+      <w:hyperlink w:anchor="_Toc243320050" w:history="1">
         <w:r>
           <w:rPr>
             <w:rStyle w:val="Hyperlink"/>
@@ -2595,7 +2595,7 @@
             <w:noProof/>
             <w:webHidden/>
           </w:rPr>
-          <w:instrText xml:space="preserve"> PAGEREF _Toc243314627 \h </w:instrText>
+          <w:instrText xml:space="preserve"> PAGEREF _Toc243320050 \h </w:instrText>
         </w:r>
         <w:r>
           <w:rPr>
@@ -2643,7 +2643,7 @@
           <w14:ligatures w14:val="standardContextual"/>
         </w:rPr>
       </w:pPr>
-      <w:hyperlink w:anchor="_Toc243314628" w:history="1">
+      <w:hyperlink w:anchor="_Toc243320051" w:history="1">
         <w:r>
           <w:rPr>
             <w:rStyle w:val="Hyperlink"/>
@@ -2670,7 +2670,7 @@
             <w:noProof/>
             <w:webHidden/>
           </w:rPr>
-          <w:instrText xml:space="preserve"> PAGEREF _Toc243314628 \h </w:instrText>
+          <w:instrText xml:space="preserve"> PAGEREF _Toc243320051 \h </w:instrText>
         </w:r>
         <w:r>
           <w:rPr>
@@ -2710,7 +2710,7 @@
       <w:pPr>
         <w:pStyle w:val="Heading1"/>
       </w:pPr>
-      <w:bookmarkStart w:id="0" w:name="_Toc243314598"/>
+      <w:bookmarkStart w:id="0" w:name="_Toc243320021"/>
       <w:r>
         <w:lastRenderedPageBreak/>
         <w:t>Part I · Understanding</w:t>
@@ -2721,7 +2721,7 @@
       <w:pPr>
         <w:pStyle w:val="Heading2"/>
       </w:pPr>
-      <w:bookmarkStart w:id="1" w:name="_Toc243314599"/>
+      <w:bookmarkStart w:id="1" w:name="_Toc243320022"/>
       <w:r>
         <w:t>1. About this guide</w:t>
       </w:r>
@@ -3967,7 +3967,7 @@
         <w:pStyle w:val="Heading2"/>
         <w:pageBreakBefore/>
       </w:pPr>
-      <w:bookmarkStart w:id="2" w:name="_Toc243314600"/>
+      <w:bookmarkStart w:id="2" w:name="_Toc243320023"/>
       <w:r>
         <w:lastRenderedPageBreak/>
         <w:t>2. RNA-seq in plain words</w:t>
@@ -4173,7 +4173,7 @@
           <w:noProof/>
         </w:rPr>
         <w:drawing>
-          <wp:inline distT="0" distB="0" distL="0" distR="0" wp14:anchorId="2B728D42" wp14:editId="64A1E668">
+          <wp:inline distT="0" distB="0" distL="0" distR="0" wp14:anchorId="4E7C57A7" wp14:editId="133B839A">
             <wp:extent cx="5852160" cy="1428107"/>
             <wp:effectExtent l="0" t="0" r="0" b="0"/>
             <wp:docPr id="2" name="Picture 2"/>
@@ -4320,7 +4320,7 @@
         </w:rPr>
         <w:lastRenderedPageBreak/>
         <w:drawing>
-          <wp:inline distT="0" distB="0" distL="0" distR="0" wp14:anchorId="3210FDEC" wp14:editId="50EA0DEA">
+          <wp:inline distT="0" distB="0" distL="0" distR="0" wp14:anchorId="6D346DEE" wp14:editId="0F6A2C24">
             <wp:extent cx="5852160" cy="2574950"/>
             <wp:effectExtent l="0" t="0" r="0" b="0"/>
             <wp:docPr id="3" name="Picture 3"/>
@@ -4571,7 +4571,7 @@
         <w:pStyle w:val="Heading2"/>
         <w:pageBreakBefore/>
       </w:pPr>
-      <w:bookmarkStart w:id="3" w:name="_Toc243314601"/>
+      <w:bookmarkStart w:id="3" w:name="_Toc243320024"/>
       <w:r>
         <w:lastRenderedPageBreak/>
         <w:t>3. What this pipeline does</w:t>
@@ -5775,7 +5775,7 @@
       <w:pPr>
         <w:pStyle w:val="Heading1"/>
       </w:pPr>
-      <w:bookmarkStart w:id="4" w:name="_Toc243314602"/>
+      <w:bookmarkStart w:id="4" w:name="_Toc243320025"/>
       <w:r>
         <w:lastRenderedPageBreak/>
         <w:t>Part II · Getting started</w:t>
@@ -5786,7 +5786,7 @@
       <w:pPr>
         <w:pStyle w:val="Heading2"/>
       </w:pPr>
-      <w:bookmarkStart w:id="5" w:name="_Toc243314603"/>
+      <w:bookmarkStart w:id="5" w:name="_Toc243320026"/>
       <w:r>
         <w:t>4. What you need</w:t>
       </w:r>
@@ -6932,7 +6932,7 @@
         <w:pStyle w:val="Heading2"/>
         <w:pageBreakBefore/>
       </w:pPr>
-      <w:bookmarkStart w:id="6" w:name="_Toc243314604"/>
+      <w:bookmarkStart w:id="6" w:name="_Toc243320027"/>
       <w:r>
         <w:lastRenderedPageBreak/>
         <w:t>5. Download and set up</w:t>
@@ -6958,7 +6958,7 @@
           <w:noProof/>
         </w:rPr>
         <w:drawing>
-          <wp:inline distT="0" distB="0" distL="0" distR="0" wp14:anchorId="3E24B947" wp14:editId="21E4A885">
+          <wp:inline distT="0" distB="0" distL="0" distR="0" wp14:anchorId="772C0B1C" wp14:editId="6FB32D8D">
             <wp:extent cx="3017520" cy="4553383"/>
             <wp:effectExtent l="0" t="0" r="0" b="0"/>
             <wp:docPr id="4" name="Picture 4"/>
@@ -7362,43 +7362,22 @@
         <w:pStyle w:val="Heading3"/>
       </w:pPr>
       <w:r>
-        <w:t>Step 2 · Download the pipeline from GitHub</w:t>
+        <w:t>Step 2 · Install pipx (the program installer)</w:t>
       </w:r>
     </w:p>
     <w:p>
       <w:r>
         <w:rPr>
           <w:rFonts w:cs="Calibri"/>
-        </w:rPr>
-        <w:t xml:space="preserve">The pipeline's source code is kept on GitHub. </w:t>
-      </w:r>
-      <w:r>
-        <w:rPr>
-          <w:rFonts w:ascii="Consolas" w:eastAsia="Consolas" w:hAnsi="Consolas" w:cs="Consolas"/>
-          <w:color w:val="9B2C2C"/>
-          <w:sz w:val="20"/>
-        </w:rPr>
-        <w:t>git clone</w:t>
+          <w:b/>
+        </w:rPr>
+        <w:t>pipx</w:t>
       </w:r>
       <w:r>
         <w:rPr>
           <w:rFonts w:cs="Calibri"/>
         </w:rPr>
-        <w:t xml:space="preserve"> downloads a copy of it into a folder called </w:t>
-      </w:r>
-      <w:r>
-        <w:rPr>
-          <w:rFonts w:ascii="Consolas" w:eastAsia="Consolas" w:hAnsi="Consolas" w:cs="Consolas"/>
-          <w:color w:val="9B2C2C"/>
-          <w:sz w:val="20"/>
-        </w:rPr>
-        <w:t>rnaseq_pipeline</w:t>
-      </w:r>
-      <w:r>
-        <w:rPr>
-          <w:rFonts w:cs="Calibri"/>
-        </w:rPr>
-        <w:t>:</w:t>
+        <w:t xml:space="preserve"> installs a Python program in its own private space and makes its command available everywhere. On Ubuntu, install it once (this one step asks for your password):</w:t>
       </w:r>
     </w:p>
     <w:tbl>
@@ -7442,7 +7421,7 @@
                 <w:color w:val="111827"/>
                 <w:sz w:val="19"/>
               </w:rPr>
-              <w:t>cd ~</w:t>
+              <w:t>sudo apt install -y pipx</w:t>
             </w:r>
           </w:p>
           <w:p>
@@ -7455,7 +7434,7 @@
                 <w:color w:val="111827"/>
                 <w:sz w:val="19"/>
               </w:rPr>
-              <w:t>git clone https://github.com/vipin839/rnaseq_pipeline.git</w:t>
+              <w:t>pipx ensurepath</w:t>
             </w:r>
           </w:p>
         </w:tc>
@@ -7471,55 +7450,7 @@
           <w:color w:val="4A5568"/>
           <w:sz w:val="20"/>
         </w:rPr>
-        <w:t xml:space="preserve">If your GitHub account has an SSH key, the SSH address works too: </w:t>
-      </w:r>
-      <w:r>
-        <w:rPr>
-          <w:rFonts w:ascii="Consolas" w:eastAsia="Consolas" w:hAnsi="Consolas" w:cs="Consolas"/>
-          <w:color w:val="9B2C2C"/>
-          <w:sz w:val="18"/>
-        </w:rPr>
-        <w:t>git clone git@github.com:vipin839/rnaseq_pipeline.git</w:t>
-      </w:r>
-      <w:r>
-        <w:rPr>
-          <w:rFonts w:cs="Calibri"/>
-          <w:color w:val="4A5568"/>
-          <w:sz w:val="20"/>
-        </w:rPr>
-        <w:t xml:space="preserve">. To get exactly version 1.1.1, add </w:t>
-      </w:r>
-      <w:r>
-        <w:rPr>
-          <w:rFonts w:ascii="Consolas" w:eastAsia="Consolas" w:hAnsi="Consolas" w:cs="Consolas"/>
-          <w:color w:val="9B2C2C"/>
-          <w:sz w:val="18"/>
-        </w:rPr>
-        <w:t>--branch v1.1.1</w:t>
-      </w:r>
-      <w:r>
-        <w:rPr>
-          <w:rFonts w:cs="Calibri"/>
-          <w:color w:val="4A5568"/>
-          <w:sz w:val="20"/>
-        </w:rPr>
-        <w:t xml:space="preserve">. If the computer says git is not installed: </w:t>
-      </w:r>
-      <w:r>
-        <w:rPr>
-          <w:rFonts w:ascii="Consolas" w:eastAsia="Consolas" w:hAnsi="Consolas" w:cs="Consolas"/>
-          <w:color w:val="9B2C2C"/>
-          <w:sz w:val="18"/>
-        </w:rPr>
-        <w:t>sudo apt install git</w:t>
-      </w:r>
-      <w:r>
-        <w:rPr>
-          <w:rFonts w:cs="Calibri"/>
-          <w:color w:val="4A5568"/>
-          <w:sz w:val="20"/>
-        </w:rPr>
-        <w:t>.</w:t>
+        <w:t>Close the Ubuntu window and open it again, so the new command location is known.</w:t>
       </w:r>
     </w:p>
     <w:p>
@@ -7527,22 +7458,41 @@
         <w:pStyle w:val="Heading3"/>
       </w:pPr>
       <w:r>
-        <w:t>Step 3 · Install the rnaseq-pipeline command</w:t>
+        <w:t>Step 3 · Install the pipeline from PyPI</w:t>
       </w:r>
     </w:p>
     <w:p>
       <w:r>
         <w:rPr>
           <w:rFonts w:cs="Calibri"/>
+        </w:rPr>
+        <w:t xml:space="preserve">The pipeline is published on </w:t>
+      </w:r>
+      <w:r>
+        <w:rPr>
+          <w:rFonts w:cs="Calibri"/>
           <w:b/>
         </w:rPr>
-        <w:t>pipx</w:t>
+        <w:t>PyPI</w:t>
       </w:r>
       <w:r>
         <w:rPr>
           <w:rFonts w:cs="Calibri"/>
         </w:rPr>
-        <w:t xml:space="preserve"> installs a Python program in its own private space and makes its command available everywhere. On Ubuntu, install pipx once (this one step asks for your password):</w:t>
+        <w:t xml:space="preserve">, the official Python package index, under the name </w:t>
+      </w:r>
+      <w:r>
+        <w:rPr>
+          <w:rFonts w:cs="Calibri"/>
+          <w:b/>
+        </w:rPr>
+        <w:t>bulk-rnaseq-pipeline</w:t>
+      </w:r>
+      <w:r>
+        <w:rPr>
+          <w:rFonts w:cs="Calibri"/>
+        </w:rPr>
+        <w:t>. One command downloads and installs it:</w:t>
       </w:r>
     </w:p>
     <w:tbl>
@@ -7586,20 +7536,7 @@
                 <w:color w:val="111827"/>
                 <w:sz w:val="19"/>
               </w:rPr>
-              <w:t>sudo apt install -y pipx</w:t>
-            </w:r>
-          </w:p>
-          <w:p>
-            <w:pPr>
-              <w:spacing w:after="0" w:line="240" w:lineRule="auto"/>
-            </w:pPr>
-            <w:r>
-              <w:rPr>
-                <w:rFonts w:ascii="Consolas" w:eastAsia="Consolas" w:hAnsi="Consolas" w:cs="Consolas"/>
-                <w:color w:val="111827"/>
-                <w:sz w:val="19"/>
-              </w:rPr>
-              <w:t>pipx ensurepath</w:t>
+              <w:t>pipx install bulk-rnaseq-pipeline</w:t>
             </w:r>
           </w:p>
         </w:tc>
@@ -7615,15 +7552,239 @@
           <w:color w:val="4A5568"/>
           <w:sz w:val="20"/>
         </w:rPr>
-        <w:t>Close the Ubuntu window and open it again, so the new command location is known.</w:t>
-      </w:r>
+        <w:t xml:space="preserve">Check it worked: </w:t>
+      </w:r>
+      <w:r>
+        <w:rPr>
+          <w:rFonts w:ascii="Consolas" w:eastAsia="Consolas" w:hAnsi="Consolas" w:cs="Consolas"/>
+          <w:color w:val="9B2C2C"/>
+          <w:sz w:val="18"/>
+        </w:rPr>
+        <w:t>rnaseq-pipeline --version</w:t>
+      </w:r>
+      <w:r>
+        <w:rPr>
+          <w:rFonts w:cs="Calibri"/>
+          <w:color w:val="4A5568"/>
+          <w:sz w:val="20"/>
+        </w:rPr>
+        <w:t xml:space="preserve"> should print </w:t>
+      </w:r>
+      <w:r>
+        <w:rPr>
+          <w:rFonts w:ascii="Consolas" w:eastAsia="Consolas" w:hAnsi="Consolas" w:cs="Consolas"/>
+          <w:color w:val="9B2C2C"/>
+          <w:sz w:val="18"/>
+        </w:rPr>
+        <w:t>Pipeline Version: 1.1.2</w:t>
+      </w:r>
+      <w:r>
+        <w:rPr>
+          <w:rFonts w:cs="Calibri"/>
+          <w:color w:val="4A5568"/>
+          <w:sz w:val="20"/>
+        </w:rPr>
+        <w:t xml:space="preserve">. The package is called bulk-rnaseq-pipeline; the command you type is </w:t>
+      </w:r>
+      <w:r>
+        <w:rPr>
+          <w:rFonts w:ascii="Consolas" w:eastAsia="Consolas" w:hAnsi="Consolas" w:cs="Consolas"/>
+          <w:color w:val="9B2C2C"/>
+          <w:sz w:val="18"/>
+        </w:rPr>
+        <w:t>rnaseq-pipeline</w:t>
+      </w:r>
+      <w:r>
+        <w:rPr>
+          <w:rFonts w:cs="Calibri"/>
+          <w:color w:val="4A5568"/>
+          <w:sz w:val="20"/>
+        </w:rPr>
+        <w:t>.</w:t>
+      </w:r>
+    </w:p>
+    <w:tbl>
+      <w:tblPr>
+        <w:tblW w:w="0" w:type="auto"/>
+        <w:jc w:val="center"/>
+        <w:tblLook w:val="04A0" w:firstRow="1" w:lastRow="0" w:firstColumn="1" w:lastColumn="0" w:noHBand="0" w:noVBand="1"/>
+      </w:tblPr>
+      <w:tblGrid>
+        <w:gridCol w:w="9411"/>
+      </w:tblGrid>
+      <w:tr>
+        <w:trPr>
+          <w:cantSplit/>
+          <w:jc w:val="center"/>
+        </w:trPr>
+        <w:tc>
+          <w:tcPr>
+            <w:tcW w:w="9411" w:type="dxa"/>
+            <w:tcBorders>
+              <w:top w:val="nil"/>
+              <w:left w:val="single" w:sz="24" w:space="0" w:color="2B6CB0"/>
+              <w:bottom w:val="nil"/>
+              <w:right w:val="nil"/>
+            </w:tcBorders>
+            <w:shd w:val="clear" w:color="auto" w:fill="EAF2FB"/>
+            <w:tcMar>
+              <w:top w:w="100" w:type="dxa"/>
+              <w:left w:w="200" w:type="dxa"/>
+              <w:bottom w:w="100" w:type="dxa"/>
+              <w:right w:w="160" w:type="dxa"/>
+            </w:tcMar>
+          </w:tcPr>
+          <w:p>
+            <w:pPr>
+              <w:spacing w:after="40"/>
+            </w:pPr>
+            <w:r>
+              <w:rPr>
+                <w:rFonts w:cs="Calibri"/>
+                <w:b/>
+                <w:color w:val="2B6CB0"/>
+                <w:sz w:val="18"/>
+              </w:rPr>
+              <w:t>TIP</w:t>
+            </w:r>
+          </w:p>
+          <w:p>
+            <w:pPr>
+              <w:spacing w:after="60"/>
+            </w:pPr>
+            <w:r>
+              <w:rPr>
+                <w:rFonts w:cs="Calibri"/>
+                <w:b/>
+                <w:sz w:val="21"/>
+              </w:rPr>
+              <w:t>Latest development version from GitHub</w:t>
+            </w:r>
+            <w:r>
+              <w:rPr>
+                <w:rFonts w:cs="Calibri"/>
+                <w:sz w:val="21"/>
+              </w:rPr>
+              <w:t xml:space="preserve"> (instead of PyPI): </w:t>
+            </w:r>
+            <w:r>
+              <w:rPr>
+                <w:rFonts w:ascii="Consolas" w:eastAsia="Consolas" w:hAnsi="Consolas" w:cs="Consolas"/>
+                <w:color w:val="9B2C2C"/>
+                <w:sz w:val="19"/>
+              </w:rPr>
+              <w:t>pipx install git+https://github.com/vipin839/rnaseq_pipeline.git</w:t>
+            </w:r>
+            <w:r>
+              <w:rPr>
+                <w:rFonts w:cs="Calibri"/>
+                <w:sz w:val="21"/>
+              </w:rPr>
+              <w:t>.</w:t>
+            </w:r>
+          </w:p>
+          <w:p>
+            <w:pPr>
+              <w:spacing w:after="60"/>
+            </w:pPr>
+            <w:r>
+              <w:rPr>
+                <w:rFonts w:cs="Calibri"/>
+                <w:b/>
+                <w:sz w:val="21"/>
+              </w:rPr>
+              <w:t>The source code itself:</w:t>
+            </w:r>
+            <w:r>
+              <w:rPr>
+                <w:rFonts w:cs="Calibri"/>
+                <w:sz w:val="21"/>
+              </w:rPr>
+              <w:t xml:space="preserve"> </w:t>
+            </w:r>
+            <w:r>
+              <w:rPr>
+                <w:rFonts w:ascii="Consolas" w:eastAsia="Consolas" w:hAnsi="Consolas" w:cs="Consolas"/>
+                <w:color w:val="9B2C2C"/>
+                <w:sz w:val="19"/>
+              </w:rPr>
+              <w:t>git clone https://github.com/vipin839/rnaseq_pipeline.git</w:t>
+            </w:r>
+            <w:r>
+              <w:rPr>
+                <w:rFonts w:cs="Calibri"/>
+                <w:sz w:val="21"/>
+              </w:rPr>
+              <w:t xml:space="preserve"> (or </w:t>
+            </w:r>
+            <w:r>
+              <w:rPr>
+                <w:rFonts w:ascii="Consolas" w:eastAsia="Consolas" w:hAnsi="Consolas" w:cs="Consolas"/>
+                <w:color w:val="9B2C2C"/>
+                <w:sz w:val="19"/>
+              </w:rPr>
+              <w:t>git clone git@github.com:vipin839/rnaseq_pipeline.git</w:t>
+            </w:r>
+            <w:r>
+              <w:rPr>
+                <w:rFonts w:cs="Calibri"/>
+                <w:sz w:val="21"/>
+              </w:rPr>
+              <w:t xml:space="preserve"> with an SSH key). From that folder the pipeline also runs without installing: </w:t>
+            </w:r>
+            <w:r>
+              <w:rPr>
+                <w:rFonts w:ascii="Consolas" w:eastAsia="Consolas" w:hAnsi="Consolas" w:cs="Consolas"/>
+                <w:color w:val="9B2C2C"/>
+                <w:sz w:val="19"/>
+              </w:rPr>
+              <w:t>~/rnaseq_pipeline/rnaseq_pipeline</w:t>
+            </w:r>
+            <w:r>
+              <w:rPr>
+                <w:rFonts w:cs="Calibri"/>
+                <w:sz w:val="21"/>
+              </w:rPr>
+              <w:t xml:space="preserve"> (needs </w:t>
+            </w:r>
+            <w:r>
+              <w:rPr>
+                <w:rFonts w:ascii="Consolas" w:eastAsia="Consolas" w:hAnsi="Consolas" w:cs="Consolas"/>
+                <w:color w:val="9B2C2C"/>
+                <w:sz w:val="19"/>
+              </w:rPr>
+              <w:t>sudo apt install python3-yaml</w:t>
+            </w:r>
+            <w:r>
+              <w:rPr>
+                <w:rFonts w:cs="Calibri"/>
+                <w:sz w:val="21"/>
+              </w:rPr>
+              <w:t>).</w:t>
+            </w:r>
+          </w:p>
+        </w:tc>
+      </w:tr>
+    </w:tbl>
+    <w:p>
+      <w:pPr>
+        <w:spacing w:after="40"/>
+      </w:pPr>
     </w:p>
     <w:p>
+      <w:pPr>
+        <w:pStyle w:val="Heading3"/>
+      </w:pPr>
+      <w:r>
+        <w:t>Step 4 · Install the scientific tools</w:t>
+      </w:r>
+    </w:p>
+    <w:p>
       <w:r>
         <w:rPr>
           <w:rFonts w:cs="Calibri"/>
         </w:rPr>
-        <w:t>Then install the pipeline from the folder you downloaded:</w:t>
+        <w:t>The pipeline carries two recipe files listing exactly the tested tool versions. These commands read them and build the two environments. They download a few gigabytes and take 10–30 minutes:</w:t>
       </w:r>
     </w:p>
     <w:tbl>
@@ -7667,7 +7828,20 @@
                 <w:color w:val="111827"/>
                 <w:sz w:val="19"/>
               </w:rPr>
-              <w:t>pipx install ~/rnaseq_pipeline</w:t>
+              <w:t>~/miniforge3/bin/mamba env create -f "$(rnaseq-pipeline --runtime-env tools)"</w:t>
+            </w:r>
+          </w:p>
+          <w:p>
+            <w:pPr>
+              <w:spacing w:after="0" w:line="240" w:lineRule="auto"/>
+            </w:pPr>
+            <w:r>
+              <w:rPr>
+                <w:rFonts w:ascii="Consolas" w:eastAsia="Consolas" w:hAnsi="Consolas" w:cs="Consolas"/>
+                <w:color w:val="111827"/>
+                <w:sz w:val="19"/>
+              </w:rPr>
+              <w:t>~/miniforge3/bin/mamba env create -f "$(rnaseq-pipeline --runtime-env r)"</w:t>
             </w:r>
           </w:p>
         </w:tc>
@@ -7683,7 +7857,7 @@
           <w:color w:val="4A5568"/>
           <w:sz w:val="20"/>
         </w:rPr>
-        <w:t xml:space="preserve">Check it worked: </w:t>
+        <w:t xml:space="preserve">The first creates </w:t>
       </w:r>
       <w:r>
         <w:rPr>
@@ -7691,7 +7865,7 @@
           <w:color w:val="9B2C2C"/>
           <w:sz w:val="18"/>
         </w:rPr>
-        <w:t>rnaseq-pipeline --version</w:t>
+        <w:t>rnaseq-tools</w:t>
       </w:r>
       <w:r>
         <w:rPr>
@@ -7699,7 +7873,7 @@
           <w:color w:val="4A5568"/>
           <w:sz w:val="20"/>
         </w:rPr>
-        <w:t xml:space="preserve"> should print </w:t>
+        <w:t xml:space="preserve"> (FastQC, MultiQC, fastp, HISAT2, samtools, StringTie, featureCounts, SRA Toolkit, RSeQC); the second creates </w:t>
       </w:r>
       <w:r>
         <w:rPr>
@@ -7707,7 +7881,7 @@
           <w:color w:val="9B2C2C"/>
           <w:sz w:val="18"/>
         </w:rPr>
-        <w:t>Pipeline Version: 1.1.1</w:t>
+        <w:t>rnaseq-r</w:t>
       </w:r>
       <w:r>
         <w:rPr>
@@ -7715,7 +7889,7 @@
           <w:color w:val="4A5568"/>
           <w:sz w:val="20"/>
         </w:rPr>
-        <w:t>.</w:t>
+        <w:t xml:space="preserve"> (R with DESeq2 and the plotting packages). The pipeline finds them automatically.</w:t>
       </w:r>
     </w:p>
     <w:tbl>
@@ -7772,37 +7946,22 @@
                 <w:rFonts w:cs="Calibri"/>
                 <w:sz w:val="21"/>
               </w:rPr>
-              <w:t xml:space="preserve">Without pipx, you can also run the pipeline straight from the downloaded folder: </w:t>
-            </w:r>
-            <w:r>
-              <w:rPr>
-                <w:rFonts w:ascii="Consolas" w:eastAsia="Consolas" w:hAnsi="Consolas" w:cs="Consolas"/>
-                <w:color w:val="9B2C2C"/>
-                <w:sz w:val="19"/>
-              </w:rPr>
-              <w:t>~/rnaseq_pipeline/rnaseq_pipeline</w:t>
-            </w:r>
-            <w:r>
-              <w:rPr>
-                <w:rFonts w:cs="Calibri"/>
+              <w:t xml:space="preserve">You can also do this step from inside the program: </w:t>
+            </w:r>
+            <w:r>
+              <w:rPr>
+                <w:rFonts w:cs="Calibri"/>
+                <w:b/>
                 <w:sz w:val="21"/>
               </w:rPr>
-              <w:t xml:space="preserve">. It then needs one small library: </w:t>
-            </w:r>
-            <w:r>
-              <w:rPr>
-                <w:rFonts w:ascii="Consolas" w:eastAsia="Consolas" w:hAnsi="Consolas" w:cs="Consolas"/>
-                <w:color w:val="9B2C2C"/>
-                <w:sz w:val="19"/>
-              </w:rPr>
-              <w:t>sudo apt install python3-yaml</w:t>
+              <w:t>Main menu → 4. Manage Dependencies → Install missing components</w:t>
             </w:r>
             <w:r>
               <w:rPr>
                 <w:rFonts w:cs="Calibri"/>
                 <w:sz w:val="21"/>
               </w:rPr>
-              <w:t>.</w:t>
+              <w:t>. It shows every command and asks before running it. On older processors (before about 2013) it automatically chooses a compatible StringTie version.</w:t>
             </w:r>
           </w:p>
         </w:tc>
@@ -7818,208 +7977,7 @@
         <w:pStyle w:val="Heading3"/>
       </w:pPr>
       <w:r>
-        <w:t>Step 4 · Install the scientific tools</w:t>
-      </w:r>
-    </w:p>
-    <w:p>
-      <w:r>
-        <w:rPr>
-          <w:rFonts w:cs="Calibri"/>
-        </w:rPr>
-        <w:t>The pipeline carries two recipe files listing exactly the tested tool versions. These commands read them and build the two environments. They download a few gigabytes and take 10–30 minutes:</w:t>
-      </w:r>
-    </w:p>
-    <w:tbl>
-      <w:tblPr>
-        <w:tblW w:w="0" w:type="auto"/>
-        <w:jc w:val="center"/>
-        <w:tblLook w:val="04A0" w:firstRow="1" w:lastRow="0" w:firstColumn="1" w:lastColumn="0" w:noHBand="0" w:noVBand="1"/>
-      </w:tblPr>
-      <w:tblGrid>
-        <w:gridCol w:w="9412"/>
-      </w:tblGrid>
-      <w:tr>
-        <w:trPr>
-          <w:cantSplit/>
-          <w:jc w:val="center"/>
-        </w:trPr>
-        <w:tc>
-          <w:tcPr>
-            <w:tcW w:w="9412" w:type="dxa"/>
-            <w:tcBorders>
-              <w:top w:val="nil"/>
-              <w:left w:val="single" w:sz="18" w:space="0" w:color="4A5568"/>
-              <w:bottom w:val="nil"/>
-              <w:right w:val="nil"/>
-            </w:tcBorders>
-            <w:shd w:val="clear" w:color="auto" w:fill="F1F3F5"/>
-            <w:tcMar>
-              <w:top w:w="90" w:type="dxa"/>
-              <w:left w:w="200" w:type="dxa"/>
-              <w:bottom w:w="90" w:type="dxa"/>
-              <w:right w:w="120" w:type="dxa"/>
-            </w:tcMar>
-          </w:tcPr>
-          <w:p>
-            <w:pPr>
-              <w:spacing w:after="0" w:line="240" w:lineRule="auto"/>
-            </w:pPr>
-            <w:r>
-              <w:rPr>
-                <w:rFonts w:ascii="Consolas" w:eastAsia="Consolas" w:hAnsi="Consolas" w:cs="Consolas"/>
-                <w:color w:val="111827"/>
-                <w:sz w:val="19"/>
-              </w:rPr>
-              <w:t>~/miniforge3/bin/mamba env create -f "$(rnaseq-pipeline --runtime-env tools)"</w:t>
-            </w:r>
-          </w:p>
-          <w:p>
-            <w:pPr>
-              <w:spacing w:after="0" w:line="240" w:lineRule="auto"/>
-            </w:pPr>
-            <w:r>
-              <w:rPr>
-                <w:rFonts w:ascii="Consolas" w:eastAsia="Consolas" w:hAnsi="Consolas" w:cs="Consolas"/>
-                <w:color w:val="111827"/>
-                <w:sz w:val="19"/>
-              </w:rPr>
-              <w:t>~/miniforge3/bin/mamba env create -f "$(rnaseq-pipeline --runtime-env r)"</w:t>
-            </w:r>
-          </w:p>
-        </w:tc>
-      </w:tr>
-    </w:tbl>
-    <w:p>
-      <w:pPr>
-        <w:spacing w:before="60"/>
-      </w:pPr>
-      <w:r>
-        <w:rPr>
-          <w:rFonts w:cs="Calibri"/>
-          <w:color w:val="4A5568"/>
-          <w:sz w:val="20"/>
-        </w:rPr>
-        <w:t xml:space="preserve">The first creates </w:t>
-      </w:r>
-      <w:r>
-        <w:rPr>
-          <w:rFonts w:ascii="Consolas" w:eastAsia="Consolas" w:hAnsi="Consolas" w:cs="Consolas"/>
-          <w:color w:val="9B2C2C"/>
-          <w:sz w:val="18"/>
-        </w:rPr>
-        <w:t>rnaseq-tools</w:t>
-      </w:r>
-      <w:r>
-        <w:rPr>
-          <w:rFonts w:cs="Calibri"/>
-          <w:color w:val="4A5568"/>
-          <w:sz w:val="20"/>
-        </w:rPr>
-        <w:t xml:space="preserve"> (FastQC, MultiQC, fastp, HISAT2, samtools, StringTie, featureCounts, SRA Toolkit, RSeQC); the second creates </w:t>
-      </w:r>
-      <w:r>
-        <w:rPr>
-          <w:rFonts w:ascii="Consolas" w:eastAsia="Consolas" w:hAnsi="Consolas" w:cs="Consolas"/>
-          <w:color w:val="9B2C2C"/>
-          <w:sz w:val="18"/>
-        </w:rPr>
-        <w:t>rnaseq-r</w:t>
-      </w:r>
-      <w:r>
-        <w:rPr>
-          <w:rFonts w:cs="Calibri"/>
-          <w:color w:val="4A5568"/>
-          <w:sz w:val="20"/>
-        </w:rPr>
-        <w:t xml:space="preserve"> (R with DESeq2 and the plotting packages). The pipeline finds them automatically.</w:t>
-      </w:r>
-    </w:p>
-    <w:tbl>
-      <w:tblPr>
-        <w:tblW w:w="0" w:type="auto"/>
-        <w:jc w:val="center"/>
-        <w:tblLook w:val="04A0" w:firstRow="1" w:lastRow="0" w:firstColumn="1" w:lastColumn="0" w:noHBand="0" w:noVBand="1"/>
-      </w:tblPr>
-      <w:tblGrid>
-        <w:gridCol w:w="9411"/>
-      </w:tblGrid>
-      <w:tr>
-        <w:trPr>
-          <w:cantSplit/>
-          <w:jc w:val="center"/>
-        </w:trPr>
-        <w:tc>
-          <w:tcPr>
-            <w:tcW w:w="9411" w:type="dxa"/>
-            <w:tcBorders>
-              <w:top w:val="nil"/>
-              <w:left w:val="single" w:sz="24" w:space="0" w:color="2B6CB0"/>
-              <w:bottom w:val="nil"/>
-              <w:right w:val="nil"/>
-            </w:tcBorders>
-            <w:shd w:val="clear" w:color="auto" w:fill="EAF2FB"/>
-            <w:tcMar>
-              <w:top w:w="100" w:type="dxa"/>
-              <w:left w:w="200" w:type="dxa"/>
-              <w:bottom w:w="100" w:type="dxa"/>
-              <w:right w:w="160" w:type="dxa"/>
-            </w:tcMar>
-          </w:tcPr>
-          <w:p>
-            <w:pPr>
-              <w:spacing w:after="40"/>
-            </w:pPr>
-            <w:r>
-              <w:rPr>
-                <w:rFonts w:cs="Calibri"/>
-                <w:b/>
-                <w:color w:val="2B6CB0"/>
-                <w:sz w:val="18"/>
-              </w:rPr>
-              <w:lastRenderedPageBreak/>
-              <w:t>TIP</w:t>
-            </w:r>
-          </w:p>
-          <w:p>
-            <w:pPr>
-              <w:spacing w:after="60"/>
-            </w:pPr>
-            <w:r>
-              <w:rPr>
-                <w:rFonts w:cs="Calibri"/>
-                <w:sz w:val="21"/>
-              </w:rPr>
-              <w:t xml:space="preserve">You can also do this step from inside the program: </w:t>
-            </w:r>
-            <w:r>
-              <w:rPr>
-                <w:rFonts w:cs="Calibri"/>
-                <w:b/>
-                <w:sz w:val="21"/>
-              </w:rPr>
-              <w:t>Main menu → 4. Manage Dependencies → Install missing components</w:t>
-            </w:r>
-            <w:r>
-              <w:rPr>
-                <w:rFonts w:cs="Calibri"/>
-                <w:sz w:val="21"/>
-              </w:rPr>
-              <w:t>. It shows every command and asks before running it. On older processors (before about 2013) it automatically chooses a compatible StringTie version.</w:t>
-            </w:r>
-          </w:p>
-        </w:tc>
-      </w:tr>
-    </w:tbl>
-    <w:p>
-      <w:pPr>
-        <w:spacing w:after="40"/>
-      </w:pPr>
-    </w:p>
-    <w:p>
-      <w:pPr>
-        <w:pStyle w:val="Heading3"/>
-      </w:pPr>
-      <w:r>
+        <w:lastRenderedPageBreak/>
         <w:t>Step 5 · Your personal settings (NCBI e-mail)</w:t>
       </w:r>
     </w:p>
@@ -8819,7 +8777,7 @@
         <w:pStyle w:val="Heading2"/>
         <w:pageBreakBefore/>
       </w:pPr>
-      <w:bookmarkStart w:id="7" w:name="_Toc243314605"/>
+      <w:bookmarkStart w:id="7" w:name="_Toc243320028"/>
       <w:r>
         <w:lastRenderedPageBreak/>
         <w:t>6. Starting the program</w:t>
@@ -10781,7 +10739,7 @@
       <w:pPr>
         <w:pStyle w:val="Heading1"/>
       </w:pPr>
-      <w:bookmarkStart w:id="8" w:name="_Toc243314606"/>
+      <w:bookmarkStart w:id="8" w:name="_Toc243320029"/>
       <w:r>
         <w:lastRenderedPageBreak/>
         <w:t>Part III · The workflow, step by step</w:t>
@@ -10792,7 +10750,7 @@
       <w:pPr>
         <w:pStyle w:val="Heading2"/>
       </w:pPr>
-      <w:bookmarkStart w:id="9" w:name="_Toc243314607"/>
+      <w:bookmarkStart w:id="9" w:name="_Toc243320030"/>
       <w:r>
         <w:t>7. The workflow at a glance</w:t>
       </w:r>
@@ -10817,7 +10775,7 @@
           <w:noProof/>
         </w:rPr>
         <w:drawing>
-          <wp:inline distT="0" distB="0" distL="0" distR="0" wp14:anchorId="5C21B3FB" wp14:editId="140290D5">
+          <wp:inline distT="0" distB="0" distL="0" distR="0" wp14:anchorId="47E76824" wp14:editId="139318E7">
             <wp:extent cx="5943600" cy="4649054"/>
             <wp:effectExtent l="0" t="0" r="0" b="0"/>
             <wp:docPr id="5" name="Picture 5"/>
@@ -11265,7 +11223,7 @@
         <w:pStyle w:val="Heading2"/>
         <w:pageBreakBefore/>
       </w:pPr>
-      <w:bookmarkStart w:id="10" w:name="_Toc243314608"/>
+      <w:bookmarkStart w:id="10" w:name="_Toc243320031"/>
       <w:r>
         <w:lastRenderedPageBreak/>
         <w:t>8. Steps 1–3 · Getting and checking the data</w:t>
@@ -13180,7 +13138,7 @@
         <w:pStyle w:val="Heading2"/>
         <w:pageBreakBefore/>
       </w:pPr>
-      <w:bookmarkStart w:id="11" w:name="_Toc243314609"/>
+      <w:bookmarkStart w:id="11" w:name="_Toc243320032"/>
       <w:r>
         <w:lastRenderedPageBreak/>
         <w:t>9. Steps 4–6 · Quality control and trimming</w:t>
@@ -15073,7 +15031,7 @@
           <w:noProof/>
         </w:rPr>
         <w:drawing>
-          <wp:inline distT="0" distB="0" distL="0" distR="0" wp14:anchorId="417AFD64" wp14:editId="2657C025">
+          <wp:inline distT="0" distB="0" distL="0" distR="0" wp14:anchorId="0D2F1802" wp14:editId="62B8C025">
             <wp:extent cx="4846320" cy="3936051"/>
             <wp:effectExtent l="0" t="0" r="0" b="0"/>
             <wp:docPr id="6" name="Picture 6"/>
@@ -15668,7 +15626,7 @@
         <w:pStyle w:val="Heading2"/>
         <w:pageBreakBefore/>
       </w:pPr>
-      <w:bookmarkStart w:id="12" w:name="_Toc243314610"/>
+      <w:bookmarkStart w:id="12" w:name="_Toc243320033"/>
       <w:r>
         <w:lastRenderedPageBreak/>
         <w:t>10. Steps 7–10 · Mapping reads to the genome</w:t>
@@ -17269,7 +17227,7 @@
           <w:noProof/>
         </w:rPr>
         <w:drawing>
-          <wp:inline distT="0" distB="0" distL="0" distR="0" wp14:anchorId="0F73049D" wp14:editId="4A84C537">
+          <wp:inline distT="0" distB="0" distL="0" distR="0" wp14:anchorId="64B026DA" wp14:editId="54CF6A1C">
             <wp:extent cx="4480560" cy="3442627"/>
             <wp:effectExtent l="0" t="0" r="0" b="0"/>
             <wp:docPr id="7" name="Picture 7"/>
@@ -18064,7 +18022,7 @@
         <w:pStyle w:val="Heading2"/>
         <w:pageBreakBefore/>
       </w:pPr>
-      <w:bookmarkStart w:id="13" w:name="_Toc243314611"/>
+      <w:bookmarkStart w:id="13" w:name="_Toc243320034"/>
       <w:r>
         <w:lastRenderedPageBreak/>
         <w:t>11. Steps 11–13 · Counting</w:t>
@@ -20158,7 +20116,7 @@
         <w:pStyle w:val="Heading2"/>
         <w:pageBreakBefore/>
       </w:pPr>
-      <w:bookmarkStart w:id="14" w:name="_Toc243314612"/>
+      <w:bookmarkStart w:id="14" w:name="_Toc243320035"/>
       <w:r>
         <w:lastRenderedPageBreak/>
         <w:t>12. Steps 14–17 · Statistics, plots and report</w:t>
@@ -21669,7 +21627,7 @@
         </w:rPr>
         <w:lastRenderedPageBreak/>
         <w:drawing>
-          <wp:inline distT="0" distB="0" distL="0" distR="0" wp14:anchorId="628EA213" wp14:editId="14EC9D9A">
+          <wp:inline distT="0" distB="0" distL="0" distR="0" wp14:anchorId="3426AA1C" wp14:editId="4A58CA44">
             <wp:extent cx="3657600" cy="4914027"/>
             <wp:effectExtent l="0" t="0" r="0" b="0"/>
             <wp:docPr id="8" name="Picture 8"/>
@@ -22584,7 +22542,7 @@
         </w:rPr>
         <w:lastRenderedPageBreak/>
         <w:drawing>
-          <wp:inline distT="0" distB="0" distL="0" distR="0" wp14:anchorId="5466E999" wp14:editId="0B1C6575">
+          <wp:inline distT="0" distB="0" distL="0" distR="0" wp14:anchorId="4B54613A" wp14:editId="7F22D5B1">
             <wp:extent cx="5486400" cy="2864726"/>
             <wp:effectExtent l="0" t="0" r="0" b="0"/>
             <wp:docPr id="9" name="Picture 9"/>
@@ -22648,7 +22606,7 @@
         <w:pStyle w:val="Heading2"/>
         <w:pageBreakBefore/>
       </w:pPr>
-      <w:bookmarkStart w:id="15" w:name="_Toc243314613"/>
+      <w:bookmarkStart w:id="15" w:name="_Toc243320036"/>
       <w:r>
         <w:lastRenderedPageBreak/>
         <w:t>13. The decisions you make</w:t>
@@ -23590,7 +23548,7 @@
       <w:pPr>
         <w:pStyle w:val="Heading1"/>
       </w:pPr>
-      <w:bookmarkStart w:id="16" w:name="_Toc243314614"/>
+      <w:bookmarkStart w:id="16" w:name="_Toc243320037"/>
       <w:r>
         <w:lastRenderedPageBreak/>
         <w:t>Part IV · Results</w:t>
@@ -23601,7 +23559,7 @@
       <w:pPr>
         <w:pStyle w:val="Heading2"/>
       </w:pPr>
-      <w:bookmarkStart w:id="17" w:name="_Toc243314615"/>
+      <w:bookmarkStart w:id="17" w:name="_Toc243320038"/>
       <w:r>
         <w:t>14. Where your results are</w:t>
       </w:r>
@@ -23654,7 +23612,7 @@
           <w:noProof/>
         </w:rPr>
         <w:drawing>
-          <wp:inline distT="0" distB="0" distL="0" distR="0" wp14:anchorId="5B6CE8EF" wp14:editId="7C30F1D6">
+          <wp:inline distT="0" distB="0" distL="0" distR="0" wp14:anchorId="766CEF84" wp14:editId="4C2DA3D9">
             <wp:extent cx="4937760" cy="5149153"/>
             <wp:effectExtent l="0" t="0" r="0" b="0"/>
             <wp:docPr id="10" name="Picture 10"/>
@@ -24701,7 +24659,7 @@
         <w:pStyle w:val="Heading2"/>
         <w:pageBreakBefore/>
       </w:pPr>
-      <w:bookmarkStart w:id="18" w:name="_Toc243314616"/>
+      <w:bookmarkStart w:id="18" w:name="_Toc243320039"/>
       <w:r>
         <w:lastRenderedPageBreak/>
         <w:t>15. Reading your results</w:t>
@@ -27529,7 +27487,7 @@
           <w:noProof/>
         </w:rPr>
         <w:drawing>
-          <wp:inline distT="0" distB="0" distL="0" distR="0" wp14:anchorId="7CBA96D9" wp14:editId="1D3A09A1">
+          <wp:inline distT="0" distB="0" distL="0" distR="0" wp14:anchorId="0DF39048" wp14:editId="53F2C277">
             <wp:extent cx="4572000" cy="3265714"/>
             <wp:effectExtent l="0" t="0" r="0" b="0"/>
             <wp:docPr id="11" name="Picture 11"/>
@@ -27654,7 +27612,7 @@
           <w:noProof/>
         </w:rPr>
         <w:drawing>
-          <wp:inline distT="0" distB="0" distL="0" distR="0" wp14:anchorId="569036A2" wp14:editId="758CDA30">
+          <wp:inline distT="0" distB="0" distL="0" distR="0" wp14:anchorId="231B44CC" wp14:editId="682AF95C">
             <wp:extent cx="3566160" cy="3056709"/>
             <wp:effectExtent l="0" t="0" r="0" b="0"/>
             <wp:docPr id="12" name="Picture 12"/>
@@ -27740,7 +27698,7 @@
           <w:noProof/>
         </w:rPr>
         <w:drawing>
-          <wp:inline distT="0" distB="0" distL="0" distR="0" wp14:anchorId="379B4E83" wp14:editId="5C1FC0CB">
+          <wp:inline distT="0" distB="0" distL="0" distR="0" wp14:anchorId="53AD218D" wp14:editId="33ED03FA">
             <wp:extent cx="4572000" cy="3429000"/>
             <wp:effectExtent l="0" t="0" r="0" b="0"/>
             <wp:docPr id="13" name="Picture 13"/>
@@ -27840,7 +27798,7 @@
           <w:noProof/>
         </w:rPr>
         <w:drawing>
-          <wp:inline distT="0" distB="0" distL="0" distR="0" wp14:anchorId="49341758" wp14:editId="6E705E83">
+          <wp:inline distT="0" distB="0" distL="0" distR="0" wp14:anchorId="26BE5AEC" wp14:editId="6FB2E60D">
             <wp:extent cx="4572000" cy="3265714"/>
             <wp:effectExtent l="0" t="0" r="0" b="0"/>
             <wp:docPr id="14" name="Picture 14"/>
@@ -27927,7 +27885,7 @@
           <w:noProof/>
         </w:rPr>
         <w:drawing>
-          <wp:inline distT="0" distB="0" distL="0" distR="0" wp14:anchorId="67E6B5BB" wp14:editId="18D6C7BD">
+          <wp:inline distT="0" distB="0" distL="0" distR="0" wp14:anchorId="3D306427" wp14:editId="047F0782">
             <wp:extent cx="3474720" cy="3971109"/>
             <wp:effectExtent l="0" t="0" r="0" b="0"/>
             <wp:docPr id="15" name="Picture 15"/>
@@ -28121,7 +28079,7 @@
         <w:pStyle w:val="Heading2"/>
         <w:pageBreakBefore/>
       </w:pPr>
-      <w:bookmarkStart w:id="19" w:name="_Toc243314617"/>
+      <w:bookmarkStart w:id="19" w:name="_Toc243320040"/>
       <w:r>
         <w:lastRenderedPageBreak/>
         <w:t>16. A worked example: Arabidopsis FERONIA</w:t>
@@ -29247,7 +29205,7 @@
       <w:pPr>
         <w:pStyle w:val="Heading1"/>
       </w:pPr>
-      <w:bookmarkStart w:id="20" w:name="_Toc243314618"/>
+      <w:bookmarkStart w:id="20" w:name="_Toc243320041"/>
       <w:r>
         <w:lastRenderedPageBreak/>
         <w:t>Part V · Everyday use</w:t>
@@ -29258,7 +29216,7 @@
       <w:pPr>
         <w:pStyle w:val="Heading2"/>
       </w:pPr>
-      <w:bookmarkStart w:id="21" w:name="_Toc243314619"/>
+      <w:bookmarkStart w:id="21" w:name="_Toc243320042"/>
       <w:r>
         <w:t>17. Resuming, changing and checking a project</w:t>
       </w:r>
@@ -29370,7 +29328,7 @@
           <w:noProof/>
         </w:rPr>
         <w:drawing>
-          <wp:inline distT="0" distB="0" distL="0" distR="0" wp14:anchorId="02B95A5B" wp14:editId="1BCC0D7B">
+          <wp:inline distT="0" distB="0" distL="0" distR="0" wp14:anchorId="184FC9D1" wp14:editId="47FE0442">
             <wp:extent cx="4846320" cy="2920630"/>
             <wp:effectExtent l="0" t="0" r="0" b="0"/>
             <wp:docPr id="16" name="Picture 16"/>
@@ -30226,7 +30184,7 @@
         <w:pStyle w:val="Heading2"/>
         <w:pageBreakBefore/>
       </w:pPr>
-      <w:bookmarkStart w:id="22" w:name="_Toc243314620"/>
+      <w:bookmarkStart w:id="22" w:name="_Toc243320043"/>
       <w:r>
         <w:lastRenderedPageBreak/>
         <w:t>18. When something goes wrong</w:t>
@@ -32232,7 +32190,7 @@
         <w:pStyle w:val="Heading2"/>
         <w:pageBreakBefore/>
       </w:pPr>
-      <w:bookmarkStart w:id="23" w:name="_Toc243314621"/>
+      <w:bookmarkStart w:id="23" w:name="_Toc243320044"/>
       <w:r>
         <w:lastRenderedPageBreak/>
         <w:t>19. Frequently asked questions</w:t>
@@ -32496,7 +32454,7 @@
       <w:pPr>
         <w:pStyle w:val="Heading1"/>
       </w:pPr>
-      <w:bookmarkStart w:id="24" w:name="_Toc243314622"/>
+      <w:bookmarkStart w:id="24" w:name="_Toc243320045"/>
       <w:r>
         <w:lastRenderedPageBreak/>
         <w:t>Part VI · Reference</w:t>
@@ -32507,7 +32465,7 @@
       <w:pPr>
         <w:pStyle w:val="Heading2"/>
       </w:pPr>
-      <w:bookmarkStart w:id="25" w:name="_Toc243314623"/>
+      <w:bookmarkStart w:id="25" w:name="_Toc243320046"/>
       <w:r>
         <w:t>20. Tools at a glance</w:t>
       </w:r>
@@ -35922,7 +35880,7 @@
         <w:pStyle w:val="Heading2"/>
         <w:pageBreakBefore/>
       </w:pPr>
-      <w:bookmarkStart w:id="26" w:name="_Toc243314624"/>
+      <w:bookmarkStart w:id="26" w:name="_Toc243320047"/>
       <w:r>
         <w:lastRenderedPageBreak/>
         <w:t>21. Glossary</w:t>
@@ -39190,7 +39148,7 @@
         <w:pStyle w:val="Heading2"/>
         <w:pageBreakBefore/>
       </w:pPr>
-      <w:bookmarkStart w:id="27" w:name="_Toc243314625"/>
+      <w:bookmarkStart w:id="27" w:name="_Toc243320048"/>
       <w:r>
         <w:lastRenderedPageBreak/>
         <w:t>22. How to cite</w:t>
@@ -39333,7 +39291,7 @@
                 <w:rFonts w:cs="Calibri"/>
                 <w:sz w:val="21"/>
               </w:rPr>
-              <w:t>Vipin (2026). rnaseq-pipeline: an interactive, validated and resumable bulk RNA-seq pipeline (version 1.1.1) [Computer software]. GitHub. https://github.com/vipin839/rnaseq_pipeline</w:t>
+              <w:t>Vipin (2026). rnaseq-pipeline: an interactive, validated and resumable bulk RNA-seq pipeline (version 1.1.2) [Computer software]. GitHub. https://github.com/vipin839/rnaseq_pipeline</w:t>
             </w:r>
           </w:p>
         </w:tc>
@@ -39414,7 +39372,7 @@
                 <w:rFonts w:cs="Calibri"/>
                 <w:sz w:val="21"/>
               </w:rPr>
-              <w:t>Bulk RNA-seq data were analysed with rnaseq-pipeline v1.1.1 (Vipin, 2026). Raw reads [from accession …] were checked for integrity, and read quality was assessed with FastQC v0.12.1 (Andrews, 2010) and MultiQC v1.35 (Ewels et al., 2016). [Adapters and low-quality ends were removed with fastp v1.3.7 (Chen et al., 2018).] Reads were aligned to the [organism, assembly, annotation source and release] genome with HISAT2 v2.2.3 (Kim et al., 2019); alignments were sorted and indexed with SAMtools v1.24 (Danecek et</w:t>
+              <w:t>Bulk RNA-seq data were analysed with rnaseq-pipeline v1.1.2 (Vipin, 2026). Raw reads [from accession …] were checked for integrity, and read quality was assessed with FastQC v0.12.1 (Andrews, 2010) and MultiQC v1.35 (Ewels et al., 2016). [Adapters and low-quality ends were removed with fastp v1.3.7 (Chen et al., 2018).] Reads were aligned to the [organism, assembly, annotation source and release] genome with HISAT2 v2.2.3 (Kim et al., 2019); alignments were sorted and indexed with SAMtools v1.24 (Danecek et</w:t>
             </w:r>
             <w:r>
               <w:rPr>
@@ -39747,7 +39705,7 @@
       <w:pPr>
         <w:pStyle w:val="Heading2"/>
       </w:pPr>
-      <w:bookmarkStart w:id="28" w:name="_Toc243314626"/>
+      <w:bookmarkStart w:id="28" w:name="_Toc243320049"/>
       <w:r>
         <w:t>23. Getting help and licence</w:t>
       </w:r>
@@ -39862,7 +39820,7 @@
         <w:pStyle w:val="Heading2"/>
         <w:pageBreakBefore/>
       </w:pPr>
-      <w:bookmarkStart w:id="29" w:name="_Toc243314627"/>
+      <w:bookmarkStart w:id="29" w:name="_Toc243320050"/>
       <w:r>
         <w:lastRenderedPageBreak/>
         <w:t>Appendix · One-page cheat sheet</w:t>
@@ -39957,7 +39915,7 @@
                 <w:color w:val="111827"/>
                 <w:sz w:val="19"/>
               </w:rPr>
-              <w:t>git clone https://github.com/vipin839/rnaseq_pipeline.git</w:t>
+              <w:t>sudo apt install -y pipx &amp;&amp; pipx ensurepath        (then reopen the terminal)</w:t>
             </w:r>
           </w:p>
           <w:p>
@@ -39970,20 +39928,7 @@
                 <w:color w:val="111827"/>
                 <w:sz w:val="19"/>
               </w:rPr>
-              <w:t>sudo apt install -y pipx &amp;&amp; pipx ensurepath        (then reopen the terminal)</w:t>
-            </w:r>
-          </w:p>
-          <w:p>
-            <w:pPr>
-              <w:spacing w:after="0" w:line="240" w:lineRule="auto"/>
-            </w:pPr>
-            <w:r>
-              <w:rPr>
-                <w:rFonts w:ascii="Consolas" w:eastAsia="Consolas" w:hAnsi="Consolas" w:cs="Consolas"/>
-                <w:color w:val="111827"/>
-                <w:sz w:val="19"/>
-              </w:rPr>
-              <w:t>pipx install ~/rnaseq_pipeline</w:t>
+              <w:t>pipx install bulk-rnaseq-pipeline</w:t>
             </w:r>
           </w:p>
           <w:p>
@@ -41199,7 +41144,7 @@
         <w:pStyle w:val="Heading2"/>
         <w:pageBreakBefore/>
       </w:pPr>
-      <w:bookmarkStart w:id="30" w:name="_Toc243314628"/>
+      <w:bookmarkStart w:id="30" w:name="_Toc243320051"/>
       <w:r>
         <w:lastRenderedPageBreak/>
         <w:t>Development and credits</w:t>
@@ -41796,7 +41741,7 @@
                 <w:rFonts w:cs="Calibri"/>
                 <w:sz w:val="19"/>
               </w:rPr>
-              <w:t>1.1.1</w:t>
+              <w:t>1.1.1–1.1.2</w:t>
             </w:r>
           </w:p>
         </w:tc>
@@ -41854,7 +41799,7 @@
                 <w:rFonts w:cs="Calibri"/>
                 <w:sz w:val="19"/>
               </w:rPr>
-              <w:t>FastQC kept at the tested 0.12 line; this illustrated user guide</w:t>
+              <w:t>FastQC fix; on PyPI as bulk-rnaseq-pipeline; this user guide</w:t>
             </w:r>
           </w:p>
         </w:tc>
@@ -42282,31 +42227,31 @@
       </w:rPr>
     </w:lvl>
   </w:abstractNum>
-  <w:num w:numId="1" w16cid:durableId="361248799">
+  <w:num w:numId="1" w16cid:durableId="1446658749">
     <w:abstractNumId w:val="8"/>
   </w:num>
-  <w:num w:numId="2" w16cid:durableId="1179926089">
+  <w:num w:numId="2" w16cid:durableId="36316422">
     <w:abstractNumId w:val="6"/>
   </w:num>
-  <w:num w:numId="3" w16cid:durableId="335036775">
+  <w:num w:numId="3" w16cid:durableId="502086916">
     <w:abstractNumId w:val="5"/>
   </w:num>
-  <w:num w:numId="4" w16cid:durableId="28577536">
+  <w:num w:numId="4" w16cid:durableId="2050254864">
     <w:abstractNumId w:val="4"/>
   </w:num>
-  <w:num w:numId="5" w16cid:durableId="1354041266">
+  <w:num w:numId="5" w16cid:durableId="1259413916">
     <w:abstractNumId w:val="7"/>
   </w:num>
-  <w:num w:numId="6" w16cid:durableId="676345930">
+  <w:num w:numId="6" w16cid:durableId="948468859">
     <w:abstractNumId w:val="3"/>
   </w:num>
-  <w:num w:numId="7" w16cid:durableId="1497770297">
+  <w:num w:numId="7" w16cid:durableId="1790540581">
     <w:abstractNumId w:val="2"/>
   </w:num>
-  <w:num w:numId="8" w16cid:durableId="316346686">
+  <w:num w:numId="8" w16cid:durableId="1326976432">
     <w:abstractNumId w:val="1"/>
   </w:num>
-  <w:num w:numId="9" w16cid:durableId="666320749">
+  <w:num w:numId="9" w16cid:durableId="2132480800">
     <w:abstractNumId w:val="0"/>
   </w:num>
 </w:numbering>
@@ -53699,7 +53644,7 @@
     <w:autoRedefine/>
     <w:uiPriority w:val="39"/>
     <w:unhideWhenUsed/>
-    <w:rsid w:val="00D612E1"/>
+    <w:rsid w:val="00104064"/>
     <w:pPr>
       <w:spacing w:after="100"/>
     </w:pPr>
@@ -53711,7 +53656,7 @@
     <w:autoRedefine/>
     <w:uiPriority w:val="39"/>
     <w:unhideWhenUsed/>
-    <w:rsid w:val="00D612E1"/>
+    <w:rsid w:val="00104064"/>
     <w:pPr>
       <w:spacing w:after="100"/>
       <w:ind w:left="220"/>
@@ -53722,7 +53667,7 @@
     <w:basedOn w:val="DefaultParagraphFont"/>
     <w:uiPriority w:val="99"/>
     <w:unhideWhenUsed/>
-    <w:rsid w:val="00D612E1"/>
+    <w:rsid w:val="00104064"/>
     <w:rPr>
       <w:color w:val="0000FF" w:themeColor="hyperlink"/>
       <w:u w:val="single"/>

</xml_diff>